<commit_message>
Report for lab 1 corrected
</commit_message>
<xml_diff>
--- a/reports/313_Воровицкая_Лаб1.docx
+++ b/reports/313_Воровицкая_Лаб1.docx
@@ -206,17 +206,7 @@
           <w:sz w:val="28"/>
           <w:szCs w:val="28"/>
         </w:rPr>
-        <w:t>Лабораторная работа №</w:t>
-      </w:r>
-      <w:r>
-        <w:rPr>
-          <w:rFonts w:eastAsia="Times New Roman" w:cs="Times New Roman" w:ascii="Times New Roman" w:hAnsi="Times New Roman"/>
-          <w:b/>
-          <w:bCs/>
-          <w:sz w:val="28"/>
-          <w:szCs w:val="28"/>
-        </w:rPr>
-        <w:t>1</w:t>
+        <w:t>Лабораторная работа №1</w:t>
       </w:r>
     </w:p>
     <w:p>
@@ -590,34 +580,7 @@
           <w:szCs w:val="28"/>
           <w:lang w:val="ru-RU"/>
         </w:rPr>
-        <w:t>3</w:t>
-      </w:r>
-      <w:r>
-        <w:rPr>
-          <w:rFonts w:eastAsia="Times New Roman" w:cs="Times New Roman" w:ascii="Times New Roman" w:hAnsi="Times New Roman"/>
-          <w:sz w:val="28"/>
-          <w:szCs w:val="28"/>
-          <w:lang w:val="ru-RU"/>
-        </w:rPr>
-        <w:t>13</w:t>
-      </w:r>
-      <w:r>
-        <w:rPr>
-          <w:rFonts w:eastAsia="Times New Roman" w:cs="Times New Roman" w:ascii="Times New Roman" w:hAnsi="Times New Roman"/>
-          <w:sz w:val="28"/>
-          <w:szCs w:val="28"/>
-          <w:lang w:val="ru-RU"/>
-        </w:rPr>
-        <w:t>Б</w:t>
-      </w:r>
-      <w:r>
-        <w:rPr>
-          <w:rFonts w:eastAsia="Times New Roman" w:cs="Times New Roman" w:ascii="Times New Roman" w:hAnsi="Times New Roman"/>
-          <w:sz w:val="28"/>
-          <w:szCs w:val="28"/>
-          <w:lang w:val="ru-RU"/>
-        </w:rPr>
-        <w:t>В</w:t>
+        <w:t>313БВ</w:t>
       </w:r>
       <w:r>
         <w:rPr>
@@ -846,6 +809,7 @@
       <w:pPr>
         <w:pStyle w:val="normal1"/>
         <w:bidi w:val="0"/>
+        <w:jc w:val="both"/>
         <w:rPr>
           <w:rFonts w:ascii="Times New Roman" w:hAnsi="Times New Roman" w:eastAsia="Times New Roman" w:cs="Times New Roman"/>
           <w:sz w:val="28"/>
@@ -867,45 +831,24 @@
           <w:szCs w:val="28"/>
           <w:lang w:val="ru-RU"/>
         </w:rPr>
-        <w:t xml:space="preserve">Цель лабораторной работы: узнать основы 3D-графики: </w:t>
-      </w:r>
-      <w:r>
-        <w:rPr>
-          <w:rFonts w:eastAsia="Times New Roman" w:cs="Times New Roman" w:ascii="Times New Roman" w:hAnsi="Times New Roman"/>
-          <w:sz w:val="28"/>
-          <w:szCs w:val="28"/>
-          <w:lang w:val="ru-RU"/>
-        </w:rPr>
-        <w:t>построение простых 3D-объектов, проекцией на 2D-плоскость, а также научиться работать с матрицами перспективы, ортографической проекции и</w:t>
+        <w:t>Цель лабораторной работы: узнать основы 3D-графики: построение простых 3D-объектов, проекцией на 2D-плоскость, а также научиться работать с матрицами перспективы, ортографической проекции и</w:t>
       </w:r>
     </w:p>
     <w:p>
       <w:pPr>
         <w:pStyle w:val="normal1"/>
         <w:bidi w:val="0"/>
-        <w:rPr>
-          <w:rFonts w:ascii="Times New Roman" w:hAnsi="Times New Roman" w:eastAsia="Times New Roman" w:cs="Times New Roman"/>
-          <w:sz w:val="28"/>
-          <w:szCs w:val="28"/>
-        </w:rPr>
-      </w:pPr>
-      <w:r>
-        <w:rPr>
-          <w:rFonts w:eastAsia="Times New Roman" w:cs="Times New Roman" w:ascii="Times New Roman" w:hAnsi="Times New Roman"/>
-          <w:sz w:val="28"/>
-          <w:szCs w:val="28"/>
-          <w:lang w:val="ru-RU"/>
-        </w:rPr>
-        <w:t xml:space="preserve">аффинными преобразованиями. Выполнен вариант: 4. Усеченный правильный тетраэдр (грани – правильные треугольники и </w:t>
-      </w:r>
-      <w:r>
-        <w:rPr>
-          <w:rFonts w:eastAsia="Times New Roman" w:cs="Times New Roman" w:ascii="Times New Roman" w:hAnsi="Times New Roman"/>
-          <w:sz w:val="28"/>
-          <w:szCs w:val="28"/>
-          <w:lang w:val="ru-RU"/>
-        </w:rPr>
-        <w:t>шестиугольники).</w:t>
+        <w:jc w:val="both"/>
+        <w:rPr/>
+      </w:pPr>
+      <w:r>
+        <w:rPr>
+          <w:rFonts w:eastAsia="Times New Roman" w:cs="Times New Roman" w:ascii="Times New Roman" w:hAnsi="Times New Roman"/>
+          <w:sz w:val="28"/>
+          <w:szCs w:val="28"/>
+          <w:lang w:val="ru-RU"/>
+        </w:rPr>
+        <w:t>аффинными преобразованиями. Выполнен вариант: 4. Усеченный правильный тетраэдр (грани – правильные треугольники и шестиугольники).</w:t>
       </w:r>
     </w:p>
     <w:p>
@@ -968,6 +911,7 @@
       <w:pPr>
         <w:pStyle w:val="normal1"/>
         <w:bidi w:val="0"/>
+        <w:jc w:val="both"/>
         <w:rPr>
           <w:rFonts w:ascii="Times New Roman" w:hAnsi="Times New Roman" w:eastAsia="Times New Roman" w:cs="Times New Roman"/>
           <w:sz w:val="28"/>
@@ -1305,34 +1249,7 @@
           <w:szCs w:val="28"/>
           <w:lang w:val="ru-RU"/>
         </w:rPr>
-        <w:t>правильн</w:t>
-      </w:r>
-      <w:r>
-        <w:rPr>
-          <w:rFonts w:eastAsia="Times New Roman" w:cs="Times New Roman" w:ascii="Times New Roman" w:hAnsi="Times New Roman"/>
-          <w:sz w:val="28"/>
-          <w:szCs w:val="28"/>
-          <w:lang w:val="ru-RU"/>
-        </w:rPr>
-        <w:t xml:space="preserve">ого </w:t>
-      </w:r>
-      <w:r>
-        <w:rPr>
-          <w:rFonts w:eastAsia="Times New Roman" w:cs="Times New Roman" w:ascii="Times New Roman" w:hAnsi="Times New Roman"/>
-          <w:sz w:val="28"/>
-          <w:szCs w:val="28"/>
-          <w:lang w:val="ru-RU"/>
-        </w:rPr>
-        <w:t>тетраэдр</w:t>
-      </w:r>
-      <w:r>
-        <w:rPr>
-          <w:rFonts w:eastAsia="Times New Roman" w:cs="Times New Roman" w:ascii="Times New Roman" w:hAnsi="Times New Roman"/>
-          <w:sz w:val="28"/>
-          <w:szCs w:val="28"/>
-          <w:lang w:val="ru-RU"/>
-        </w:rPr>
-        <w:t xml:space="preserve">а </w:t>
+        <w:t xml:space="preserve">правильного тетраэдра </w:t>
       </w:r>
       <w:r>
         <w:rPr>
@@ -1349,77 +1266,24 @@
           <w:szCs w:val="28"/>
           <w:lang w:val="ru-RU"/>
         </w:rPr>
-        <w:t>шестиугольника</w:t>
-      </w:r>
-      <w:r>
-        <w:rPr>
-          <w:rFonts w:eastAsia="Times New Roman" w:cs="Times New Roman" w:ascii="Times New Roman" w:hAnsi="Times New Roman"/>
-          <w:sz w:val="28"/>
-          <w:szCs w:val="28"/>
-          <w:lang w:val="ru-RU"/>
-        </w:rPr>
-        <w:t>. И</w:t>
-      </w:r>
-      <w:r>
-        <w:rPr>
-          <w:rFonts w:eastAsia="Times New Roman" w:cs="Times New Roman" w:ascii="Times New Roman" w:hAnsi="Times New Roman"/>
-          <w:sz w:val="28"/>
-          <w:szCs w:val="28"/>
-          <w:lang w:val="ru-RU"/>
-        </w:rPr>
-        <w:t>ндексы</w:t>
-      </w:r>
-      <w:r>
-        <w:rPr>
-          <w:rFonts w:eastAsia="Times New Roman" w:cs="Times New Roman" w:ascii="Times New Roman" w:hAnsi="Times New Roman"/>
-          <w:sz w:val="28"/>
-          <w:szCs w:val="28"/>
-        </w:rPr>
-        <w:t xml:space="preserve"> формируются функциями addTriangle и addHexagon, </w:t>
-      </w:r>
-      <w:r>
-        <w:rPr>
-          <w:rFonts w:eastAsia="Times New Roman" w:cs="Times New Roman" w:ascii="Times New Roman" w:hAnsi="Times New Roman"/>
-          <w:sz w:val="28"/>
-          <w:szCs w:val="28"/>
-        </w:rPr>
-        <w:t>в</w:t>
-      </w:r>
-      <w:r>
-        <w:rPr>
-          <w:rFonts w:eastAsia="Times New Roman" w:cs="Times New Roman" w:ascii="Times New Roman" w:hAnsi="Times New Roman"/>
-          <w:sz w:val="28"/>
-          <w:szCs w:val="28"/>
-          <w:lang w:val="ru-RU"/>
-        </w:rPr>
-        <w:t>сего</w:t>
-      </w:r>
-      <w:r>
-        <w:rPr>
-          <w:rFonts w:eastAsia="Times New Roman" w:cs="Times New Roman" w:ascii="Times New Roman" w:hAnsi="Times New Roman"/>
-          <w:sz w:val="28"/>
-          <w:szCs w:val="28"/>
-          <w:lang w:val="ru-RU"/>
-        </w:rPr>
-        <w:t xml:space="preserve"> </w:t>
-      </w:r>
-      <w:r>
-        <w:rPr>
-          <w:rFonts w:eastAsia="Times New Roman" w:cs="Times New Roman" w:ascii="Times New Roman" w:hAnsi="Times New Roman"/>
-          <w:sz w:val="28"/>
-          <w:szCs w:val="28"/>
-          <w:lang w:val="ru-RU"/>
-        </w:rPr>
-        <w:t>шестьдесят</w:t>
-      </w:r>
-      <w:r>
-        <w:rPr>
-          <w:rFonts w:eastAsia="Times New Roman" w:cs="Times New Roman" w:ascii="Times New Roman" w:hAnsi="Times New Roman"/>
-          <w:sz w:val="28"/>
-          <w:szCs w:val="28"/>
-          <w:lang w:val="ru-RU"/>
-        </w:rPr>
-        <w:t xml:space="preserve"> </w:t>
+        <w:t>шестиугольника. Индексы</w:t>
+      </w:r>
+      <w:r>
+        <w:rPr>
+          <w:rFonts w:eastAsia="Times New Roman" w:cs="Times New Roman" w:ascii="Times New Roman" w:hAnsi="Times New Roman"/>
+          <w:sz w:val="28"/>
+          <w:szCs w:val="28"/>
+        </w:rPr>
+        <w:t xml:space="preserve"> формируются функциями addTriangle и addHexagon, в</w:t>
+      </w:r>
+      <w:r>
+        <w:rPr>
+          <w:rFonts w:eastAsia="Times New Roman" w:cs="Times New Roman" w:ascii="Times New Roman" w:hAnsi="Times New Roman"/>
+          <w:sz w:val="28"/>
+          <w:szCs w:val="28"/>
+          <w:lang w:val="ru-RU"/>
+        </w:rPr>
+        <w:t xml:space="preserve">сего шестьдесят </w:t>
       </w:r>
       <w:r>
         <w:rPr>
@@ -1487,16 +1351,7 @@
           <w:szCs w:val="28"/>
           <w:lang w:val="ru-RU"/>
         </w:rPr>
-        <w:t xml:space="preserve"> </w:t>
-      </w:r>
-      <w:r>
-        <w:rPr>
-          <w:rFonts w:eastAsia="Times New Roman" w:cs="Times New Roman" w:ascii="Times New Roman" w:hAnsi="Times New Roman"/>
-          <w:sz w:val="28"/>
-          <w:szCs w:val="28"/>
-          <w:lang w:val="ru-RU"/>
-        </w:rPr>
-        <w:t xml:space="preserve">из 16 элементов </w:t>
+        <w:t xml:space="preserve"> из 16 элементов </w:t>
       </w:r>
       <w:r>
         <w:rPr>
@@ -1564,25 +1419,7 @@
           <w:szCs w:val="28"/>
           <w:lang w:val="ru-RU"/>
         </w:rPr>
-        <w:t>V</w:t>
-      </w:r>
-      <w:r>
-        <w:rPr>
-          <w:rFonts w:eastAsia="Times New Roman" w:cs="Times New Roman" w:ascii="Times New Roman" w:hAnsi="Times New Roman"/>
-          <w:sz w:val="28"/>
-          <w:szCs w:val="28"/>
-          <w:lang w:val="ru-RU"/>
-        </w:rPr>
-        <w:t xml:space="preserve">. </w:t>
-      </w:r>
-      <w:r>
-        <w:rPr>
-          <w:rFonts w:eastAsia="Times New Roman" w:cs="Times New Roman" w:ascii="Times New Roman" w:hAnsi="Times New Roman"/>
-          <w:sz w:val="28"/>
-          <w:szCs w:val="28"/>
-          <w:lang w:val="ru-RU"/>
-        </w:rPr>
-        <w:t>VkPipelineVertexInputStateCreateInfo</w:t>
+        <w:t>V. VkPipelineVertexInputStateCreateInfo</w:t>
       </w:r>
       <w:r>
         <w:rPr>
@@ -1684,25 +1521,7 @@
           <w:szCs w:val="28"/>
           <w:lang w:val="ru-RU"/>
         </w:rPr>
-        <w:t xml:space="preserve"> </w:t>
-      </w:r>
-      <w:r>
-        <w:rPr>
-          <w:rFonts w:eastAsia="Times New Roman" w:cs="Times New Roman" w:ascii="Times New Roman" w:hAnsi="Times New Roman"/>
-          <w:sz w:val="28"/>
-          <w:szCs w:val="28"/>
-          <w:lang w:val="ru-RU"/>
-        </w:rPr>
-        <w:t>выполнена</w:t>
-      </w:r>
-      <w:r>
-        <w:rPr>
-          <w:rFonts w:eastAsia="Times New Roman" w:cs="Times New Roman" w:ascii="Times New Roman" w:hAnsi="Times New Roman"/>
-          <w:sz w:val="28"/>
-          <w:szCs w:val="28"/>
-          <w:lang w:val="ru-RU"/>
-        </w:rPr>
-        <w:t xml:space="preserve"> </w:t>
+        <w:t xml:space="preserve"> выполнена </w:t>
       </w:r>
       <w:r>
         <w:rPr>
@@ -1901,6 +1720,7 @@
       <w:pPr>
         <w:pStyle w:val="normal1"/>
         <w:ind w:firstLine="720"/>
+        <w:jc w:val="both"/>
         <w:rPr>
           <w:rFonts w:ascii="Times New Roman" w:hAnsi="Times New Roman" w:eastAsia="Times New Roman" w:cs="Times New Roman"/>
           <w:sz w:val="28"/>
@@ -1971,12 +1791,8 @@
         <w:pStyle w:val="normal1"/>
         <w:bidi w:val="0"/>
         <w:ind w:firstLine="720"/>
-        <w:rPr>
-          <w:rFonts w:ascii="Times New Roman" w:hAnsi="Times New Roman" w:eastAsia="Times New Roman" w:cs="Times New Roman"/>
-          <w:sz w:val="28"/>
-          <w:szCs w:val="28"/>
-          <w:lang w:val="ru-RU"/>
-        </w:rPr>
+        <w:jc w:val="both"/>
+        <w:rPr/>
       </w:pPr>
       <w:r>
         <w:drawing>
@@ -2062,6 +1878,7 @@
         <w:pStyle w:val="normal1"/>
         <w:bidi w:val="0"/>
         <w:ind w:firstLine="720"/>
+        <w:jc w:val="both"/>
         <w:rPr>
           <w:rFonts w:ascii="Times New Roman" w:hAnsi="Times New Roman" w:eastAsia="Times New Roman" w:cs="Times New Roman"/>
           <w:sz w:val="28"/>
@@ -2187,6 +2004,7 @@
       <w:pPr>
         <w:pStyle w:val="normal1"/>
         <w:bidi w:val="0"/>
+        <w:jc w:val="both"/>
         <w:rPr>
           <w:rFonts w:ascii="Times New Roman" w:hAnsi="Times New Roman" w:eastAsia="Times New Roman" w:cs="Times New Roman"/>
           <w:sz w:val="28"/>
@@ -2315,6 +2133,7 @@
     <w:name w:val="Normal"/>
     <w:pPr>
       <w:widowControl/>
+      <w:suppressAutoHyphens w:val="true"/>
       <w:bidi w:val="0"/>
       <w:spacing w:lineRule="auto" w:line="276" w:before="0" w:after="0"/>
       <w:jc w:val="start"/>
@@ -2483,10 +2302,35 @@
       <w:rFonts w:cs="Arial"/>
     </w:rPr>
   </w:style>
+  <w:style w:type="paragraph" w:styleId="user">
+    <w:name w:val="Заголовок (user)"/>
+    <w:basedOn w:val="Normal"/>
+    <w:next w:val="BodyText"/>
+    <w:pPr>
+      <w:keepNext w:val="true"/>
+      <w:spacing w:before="240" w:after="120"/>
+    </w:pPr>
+    <w:rPr>
+      <w:rFonts w:ascii="Liberation Sans" w:hAnsi="Liberation Sans" w:eastAsia="Microsoft YaHei" w:cs="Arial"/>
+      <w:sz w:val="28"/>
+      <w:szCs w:val="28"/>
+    </w:rPr>
+  </w:style>
+  <w:style w:type="paragraph" w:styleId="user1">
+    <w:name w:val="Указатель (user)"/>
+    <w:basedOn w:val="Normal"/>
+    <w:pPr>
+      <w:suppressLineNumbers/>
+    </w:pPr>
+    <w:rPr>
+      <w:rFonts w:cs="Arial"/>
+    </w:rPr>
+  </w:style>
   <w:style w:type="paragraph" w:styleId="normal1" w:default="1">
     <w:name w:val="normal1"/>
     <w:pPr>
       <w:widowControl/>
+      <w:suppressAutoHyphens w:val="true"/>
       <w:bidi w:val="0"/>
       <w:spacing w:lineRule="auto" w:line="276" w:before="0" w:after="0"/>
       <w:jc w:val="start"/>

</xml_diff>